<commit_message>
Align backend INFO rendering with LLM schema
</commit_message>
<xml_diff>
--- a/backend/templates/info-template.docx
+++ b/backend/templates/info-template.docx
@@ -130,86 +130,6 @@
           <w:b/>
           <w:bCs/>
         </w:rPr>
-        <w:t xml:space="preserve">Website</w:t>
-      </w:r>
-    </w:p>
-    <w:p>
-      <w:r>
-        <w:t xml:space="preserve">{website}</w:t>
-      </w:r>
-    </w:p>
-    <w:p/>
-    <w:p>
-      <w:r>
-        <w:rPr>
-          <w:b/>
-          <w:bCs/>
-        </w:rPr>
-        <w:t xml:space="preserve">Social Media</w:t>
-      </w:r>
-    </w:p>
-    <w:p>
-      <w:r>
-        <w:t xml:space="preserve">{#socialMedia}</w:t>
-      </w:r>
-    </w:p>
-    <w:p>
-      <w:r>
-        <w:t xml:space="preserve">Facebook: {facebook}</w:t>
-      </w:r>
-    </w:p>
-    <w:p>
-      <w:r>
-        <w:t xml:space="preserve">LinkedIn: {linkedin}</w:t>
-      </w:r>
-    </w:p>
-    <w:p>
-      <w:r>
-        <w:t xml:space="preserve">YouTube: {youtube}</w:t>
-      </w:r>
-    </w:p>
-    <w:p>
-      <w:r>
-        <w:t xml:space="preserve">{/socialMedia}</w:t>
-      </w:r>
-    </w:p>
-    <w:p/>
-    <w:p>
-      <w:r>
-        <w:rPr>
-          <w:b/>
-          <w:bCs/>
-        </w:rPr>
-        <w:t xml:space="preserve">Repository</w:t>
-      </w:r>
-    </w:p>
-    <w:p>
-      <w:r>
-        <w:t xml:space="preserve">{repository}</w:t>
-      </w:r>
-    </w:p>
-    <w:p/>
-    <w:p>
-      <w:r>
-        <w:rPr>
-          <w:b/>
-          <w:bCs/>
-        </w:rPr>
-        <w:t xml:space="preserve">Mailing lists</w:t>
-      </w:r>
-    </w:p>
-    <w:p>
-      <w:r>
-        <w:t xml:space="preserve">{mailingLists}</w:t>
-      </w:r>
-    </w:p>
-    <w:p/>
-    <w:p>
-      <w:r>
-        <w:rPr>
-          <w:b/>
-          <w:bCs/>
-        </w:rPr>
         <w:t xml:space="preserve">VIL Efforts</w:t>
       </w:r>
     </w:p>
@@ -218,6 +138,99 @@
         <w:t xml:space="preserve">{ownEffortSummary}</w:t>
       </w:r>
     </w:p>
+    <w:p>
+      <w:r>
+        <w:t xml:space="preserve">Total: {ownEntityTotalPersonMonths} person-months</w:t>
+      </w:r>
+    </w:p>
+    <w:p>
+      <w:r>
+        <w:t xml:space="preserve">{#workPackages}</w:t>
+      </w:r>
+    </w:p>
+    <w:p>
+      <w:r>
+        <w:t xml:space="preserve">{#isOwnEntityInvolved}</w:t>
+      </w:r>
+    </w:p>
+    <w:p>
+      <w:r>
+        <w:rPr>
+          <w:b/>
+          <w:bCs/>
+        </w:rPr>
+        <w:t xml:space="preserve">{id} - {name}: {ownEntityPersonMonths} person-months</w:t>
+      </w:r>
+    </w:p>
+    <w:p>
+      <w:r>
+        <w:t xml:space="preserve">{/isOwnEntityInvolved}</w:t>
+      </w:r>
+    </w:p>
+    <w:p>
+      <w:r>
+        <w:t xml:space="preserve">{^isOwnEntityInvolved}</w:t>
+      </w:r>
+    </w:p>
+    <w:p>
+      <w:r>
+        <w:t xml:space="preserve">{id} - {name}: {ownEntityPersonMonths} person-months</w:t>
+      </w:r>
+    </w:p>
+    <w:p>
+      <w:r>
+        <w:t xml:space="preserve">{/isOwnEntityInvolved}</w:t>
+      </w:r>
+    </w:p>
+    <w:p>
+      <w:r>
+        <w:t xml:space="preserve">{#tasks}</w:t>
+      </w:r>
+    </w:p>
+    <w:p>
+      <w:r>
+        <w:t xml:space="preserve">{#isOwnEntityInvolved}</w:t>
+      </w:r>
+    </w:p>
+    <w:p>
+      <w:r>
+        <w:rPr>
+          <w:b/>
+          <w:bCs/>
+        </w:rPr>
+        <w:t xml:space="preserve">Task {id} - {name} [{leader} | {durationLabel} | participants: {participantsLabel}]</w:t>
+      </w:r>
+    </w:p>
+    <w:p>
+      <w:r>
+        <w:t xml:space="preserve">{/isOwnEntityInvolved}</w:t>
+      </w:r>
+    </w:p>
+    <w:p>
+      <w:r>
+        <w:t xml:space="preserve">{^isOwnEntityInvolved}</w:t>
+      </w:r>
+    </w:p>
+    <w:p>
+      <w:r>
+        <w:t xml:space="preserve">Task {id} - {name} [{leader} | {durationLabel} | participants: {participantsLabel}]</w:t>
+      </w:r>
+    </w:p>
+    <w:p>
+      <w:r>
+        <w:t xml:space="preserve">{/isOwnEntityInvolved}</w:t>
+      </w:r>
+    </w:p>
+    <w:p>
+      <w:r>
+        <w:t xml:space="preserve">{/tasks}</w:t>
+      </w:r>
+    </w:p>
+    <w:p>
+      <w:r>
+        <w:t xml:space="preserve">{/workPackages}</w:t>
+      </w:r>
+    </w:p>
     <w:p/>
     <w:p>
       <w:pPr>
@@ -234,7 +247,36 @@
     </w:p>
     <w:p>
       <w:r>
-        <w:t xml:space="preserve">{id} - {name} [{leadBeneficiary} | M{monthFrom}-M{monthTo}]</w:t>
+        <w:t xml:space="preserve">{#isOwnEntityInvolved}</w:t>
+      </w:r>
+    </w:p>
+    <w:p>
+      <w:r>
+        <w:rPr>
+          <w:b/>
+          <w:bCs/>
+        </w:rPr>
+        <w:t xml:space="preserve">{id} - {name} [{leadBeneficiary} | {durationLabel}]</w:t>
+      </w:r>
+    </w:p>
+    <w:p>
+      <w:r>
+        <w:t xml:space="preserve">{/isOwnEntityInvolved}</w:t>
+      </w:r>
+    </w:p>
+    <w:p>
+      <w:r>
+        <w:t xml:space="preserve">{^isOwnEntityInvolved}</w:t>
+      </w:r>
+    </w:p>
+    <w:p>
+      <w:r>
+        <w:t xml:space="preserve">{id} - {name} [{leadBeneficiary} | {durationLabel}]</w:t>
+      </w:r>
+    </w:p>
+    <w:p>
+      <w:r>
+        <w:t xml:space="preserve">{/isOwnEntityInvolved}</w:t>
       </w:r>
     </w:p>
     <w:p>
@@ -244,7 +286,36 @@
     </w:p>
     <w:p>
       <w:r>
-        <w:t xml:space="preserve">Task {id} - {name} [{leader} | M{monthFrom}-M{monthTo}]</w:t>
+        <w:t xml:space="preserve">{#isOwnEntityInvolved}</w:t>
+      </w:r>
+    </w:p>
+    <w:p>
+      <w:r>
+        <w:rPr>
+          <w:b/>
+          <w:bCs/>
+        </w:rPr>
+        <w:t xml:space="preserve">Task {id} - {name} [{leader} | {durationLabel}]</w:t>
+      </w:r>
+    </w:p>
+    <w:p>
+      <w:r>
+        <w:t xml:space="preserve">{/isOwnEntityInvolved}</w:t>
+      </w:r>
+    </w:p>
+    <w:p>
+      <w:r>
+        <w:t xml:space="preserve">{^isOwnEntityInvolved}</w:t>
+      </w:r>
+    </w:p>
+    <w:p>
+      <w:r>
+        <w:t xml:space="preserve">Task {id} - {name} [{leader} | {durationLabel}]</w:t>
+      </w:r>
+    </w:p>
+    <w:p>
+      <w:r>
+        <w:t xml:space="preserve">{/isOwnEntityInvolved}</w:t>
       </w:r>
     </w:p>
     <w:p>
@@ -255,30 +326,6 @@
     <w:p>
       <w:r>
         <w:t xml:space="preserve">{/workPackages}</w:t>
-      </w:r>
-    </w:p>
-    <w:p/>
-    <w:p>
-      <w:pPr>
-        <w:pStyle w:val="Heading2"/>
-      </w:pPr>
-      <w:r>
-        <w:t xml:space="preserve">Roles</w:t>
-      </w:r>
-    </w:p>
-    <w:p>
-      <w:r>
-        <w:t xml:space="preserve">{#roles}</w:t>
-      </w:r>
-    </w:p>
-    <w:p>
-      <w:r>
-        <w:t xml:space="preserve">{title}: {name} (M{periodFrom} - {periodTo})</w:t>
-      </w:r>
-    </w:p>
-    <w:p>
-      <w:r>
-        <w:t xml:space="preserve">{/roles}</w:t>
       </w:r>
     </w:p>
     <w:sectPr>

</xml_diff>